<commit_message>
Lease Generation - Greece
</commit_message>
<xml_diff>
--- a/pages/templates/lease_templates/cyprus_greek_lease_template.docx
+++ b/pages/templates/lease_templates/cyprus_greek_lease_template.docx
@@ -4239,9 +4239,13 @@
         <w:spacing w:after="0" w:line="240" w:lineRule="auto"/>
         <w:ind w:left="284" w:hanging="284"/>
         <w:jc w:val="both"/>
-      </w:pPr>
-      <w:r>
-        <w:rPr>
+        <w:rPr>
+          <w:rFonts w:cs="Calibri"/>
+        </w:rPr>
+      </w:pPr>
+      <w:r>
+        <w:rPr>
+          <w:rFonts w:cs="Calibri"/>
           <w:lang w:val="en-US"/>
         </w:rPr>
         <w:t xml:space="preserve">{% if </w:t>
@@ -4249,6 +4253,7 @@
       <w:proofErr w:type="spellStart"/>
       <w:r>
         <w:rPr>
+          <w:rFonts w:cs="Calibri"/>
           <w:lang w:val="en-US"/>
         </w:rPr>
         <w:t>keys_list_greek</w:t>
@@ -4256,6 +4261,7 @@
       <w:proofErr w:type="spellEnd"/>
       <w:r>
         <w:rPr>
+          <w:rFonts w:cs="Calibri"/>
           <w:lang w:val="en-US"/>
         </w:rPr>
         <w:t xml:space="preserve"> and </w:t>
@@ -4263,6 +4269,7 @@
       <w:proofErr w:type="spellStart"/>
       <w:r>
         <w:rPr>
+          <w:rFonts w:cs="Calibri"/>
           <w:lang w:val="en-US"/>
         </w:rPr>
         <w:t>keys_list_</w:t>
@@ -4270,6 +4277,7 @@
       <w:proofErr w:type="gramStart"/>
       <w:r>
         <w:rPr>
+          <w:rFonts w:cs="Calibri"/>
           <w:lang w:val="en-US"/>
         </w:rPr>
         <w:t>greek</w:t>
@@ -4277,6 +4285,7 @@
       <w:proofErr w:type="spellEnd"/>
       <w:r>
         <w:rPr>
+          <w:rFonts w:cs="Calibri"/>
           <w:lang w:val="en-US"/>
         </w:rPr>
         <w:t xml:space="preserve"> !</w:t>
@@ -4284,65 +4293,70 @@
       <w:proofErr w:type="gramEnd"/>
       <w:r>
         <w:rPr>
+          <w:rFonts w:cs="Calibri"/>
           <w:lang w:val="en-US"/>
         </w:rPr>
         <w:t xml:space="preserve">= </w:t>
       </w:r>
       <w:r>
+        <w:rPr>
+          <w:rFonts w:cs="Calibri"/>
+        </w:rPr>
         <w:t xml:space="preserve">'Κανένα' </w:t>
       </w:r>
       <w:proofErr w:type="gramStart"/>
       <w:r>
+        <w:rPr>
+          <w:rFonts w:cs="Calibri"/>
+        </w:rPr>
         <w:t>%}</w:t>
       </w:r>
       <w:r>
+        <w:rPr>
+          <w:rFonts w:cs="Calibri"/>
+        </w:rPr>
         <w:t>Ο</w:t>
       </w:r>
       <w:proofErr w:type="gramEnd"/>
       <w:r>
+        <w:rPr>
+          <w:rFonts w:cs="Calibri"/>
+        </w:rPr>
         <w:t xml:space="preserve"> ΙΔΙΟΚΤΗΤΗΣ υποχρεούται όπως την </w:t>
       </w:r>
       <w:proofErr w:type="gramStart"/>
       <w:r>
         <w:rPr>
-          <w:rFonts w:ascii="Trebuchet MS" w:hAnsi="Trebuchet MS"/>
+          <w:rFonts w:cs="Calibri"/>
           <w:b/>
           <w:bCs/>
-          <w:sz w:val="20"/>
-          <w:szCs w:val="20"/>
         </w:rPr>
         <w:t xml:space="preserve">{{ </w:t>
       </w:r>
       <w:proofErr w:type="spellStart"/>
       <w:r>
         <w:rPr>
-          <w:rFonts w:ascii="Trebuchet MS" w:hAnsi="Trebuchet MS"/>
+          <w:rFonts w:cs="Calibri"/>
           <w:b/>
           <w:bCs/>
-          <w:sz w:val="20"/>
-          <w:szCs w:val="20"/>
         </w:rPr>
         <w:t>lease</w:t>
       </w:r>
       <w:proofErr w:type="gramEnd"/>
       <w:r>
         <w:rPr>
-          <w:rFonts w:ascii="Trebuchet MS" w:hAnsi="Trebuchet MS"/>
+          <w:rFonts w:cs="Calibri"/>
           <w:b/>
           <w:bCs/>
-          <w:sz w:val="20"/>
-          <w:szCs w:val="20"/>
         </w:rPr>
         <w:t>_start_date</w:t>
       </w:r>
       <w:proofErr w:type="spellEnd"/>
       <w:r>
         <w:rPr>
-          <w:rFonts w:ascii="Trebuchet MS" w:hAnsi="Trebuchet MS"/>
+          <w:rFonts w:cs="Calibri"/>
           <w:b/>
           <w:bCs/>
-          <w:sz w:val="20"/>
-          <w:szCs w:val="20"/>
         </w:rPr>
         <w:t>_</w:t>
       </w:r>
@@ -4350,11 +4364,9 @@
       <w:proofErr w:type="gramStart"/>
       <w:r>
         <w:rPr>
-          <w:rFonts w:ascii="Trebuchet MS" w:hAnsi="Trebuchet MS"/>
+          <w:rFonts w:cs="Calibri"/>
           <w:b/>
           <w:bCs/>
-          <w:sz w:val="20"/>
-          <w:szCs w:val="20"/>
           <w:lang w:val="en-US"/>
         </w:rPr>
         <w:t>greek</w:t>
@@ -4362,22 +4374,18 @@
       <w:proofErr w:type="spellEnd"/>
       <w:r>
         <w:rPr>
-          <w:rFonts w:ascii="Trebuchet MS" w:hAnsi="Trebuchet MS"/>
+          <w:rFonts w:cs="Calibri"/>
           <w:b/>
           <w:bCs/>
-          <w:sz w:val="20"/>
-          <w:szCs w:val="20"/>
         </w:rPr>
         <w:t xml:space="preserve"> }</w:t>
       </w:r>
       <w:proofErr w:type="gramEnd"/>
       <w:r>
         <w:rPr>
-          <w:rFonts w:ascii="Trebuchet MS" w:hAnsi="Trebuchet MS"/>
+          <w:rFonts w:cs="Calibri"/>
           <w:b/>
           <w:bCs/>
-          <w:sz w:val="20"/>
-          <w:szCs w:val="20"/>
         </w:rPr>
         <w:t>}</w:t>
       </w:r>
@@ -4389,13 +4397,22 @@
       </w:r>
       <w:proofErr w:type="gramStart"/>
       <w:r>
+        <w:rPr>
+          <w:rFonts w:cs="Calibri"/>
+        </w:rPr>
         <w:t>παραδώσει  στον</w:t>
       </w:r>
       <w:proofErr w:type="gramEnd"/>
       <w:r>
+        <w:rPr>
+          <w:rFonts w:cs="Calibri"/>
+        </w:rPr>
         <w:t xml:space="preserve"> ΕΝΟΙΚΙΑΣΤΗ</w:t>
       </w:r>
       <w:r>
+        <w:rPr>
+          <w:rFonts w:cs="Calibri"/>
+        </w:rPr>
         <w:t>:</w:t>
       </w:r>
     </w:p>
@@ -4408,35 +4425,34 @@
         </w:numPr>
         <w:spacing w:after="0" w:line="240" w:lineRule="auto"/>
         <w:jc w:val="both"/>
-      </w:pPr>
-      <w:r>
-        <w:rPr>
-          <w:rFonts w:ascii="Trebuchet MS" w:hAnsi="Trebuchet MS"/>
-          <w:szCs w:val="20"/>
+        <w:rPr>
+          <w:rFonts w:cs="Calibri"/>
+        </w:rPr>
+      </w:pPr>
+      <w:r>
+        <w:rPr>
+          <w:rFonts w:cs="Calibri"/>
         </w:rPr>
         <w:t xml:space="preserve">{{ </w:t>
       </w:r>
       <w:proofErr w:type="spellStart"/>
       <w:r>
         <w:rPr>
-          <w:rFonts w:ascii="Trebuchet MS" w:hAnsi="Trebuchet MS"/>
-          <w:szCs w:val="20"/>
+          <w:rFonts w:cs="Calibri"/>
         </w:rPr>
         <w:t>keys_list</w:t>
       </w:r>
       <w:proofErr w:type="spellEnd"/>
       <w:r>
         <w:rPr>
-          <w:rFonts w:ascii="Trebuchet MS" w:hAnsi="Trebuchet MS"/>
-          <w:szCs w:val="20"/>
+          <w:rFonts w:cs="Calibri"/>
         </w:rPr>
         <w:t>_</w:t>
       </w:r>
       <w:proofErr w:type="spellStart"/>
       <w:r>
         <w:rPr>
-          <w:rFonts w:ascii="Trebuchet MS" w:hAnsi="Trebuchet MS"/>
-          <w:szCs w:val="20"/>
+          <w:rFonts w:cs="Calibri"/>
           <w:lang w:val="en-US"/>
         </w:rPr>
         <w:t>greek</w:t>
@@ -4444,8 +4460,7 @@
       <w:proofErr w:type="spellEnd"/>
       <w:r>
         <w:rPr>
-          <w:rFonts w:ascii="Trebuchet MS" w:hAnsi="Trebuchet MS"/>
-          <w:szCs w:val="20"/>
+          <w:rFonts w:cs="Calibri"/>
         </w:rPr>
         <w:t xml:space="preserve"> }}</w:t>
       </w:r>
@@ -4456,57 +4471,53 @@
         <w:spacing w:after="0" w:line="240" w:lineRule="auto"/>
         <w:ind w:left="0" w:firstLine="284"/>
         <w:jc w:val="both"/>
-      </w:pPr>
-      <w:r>
-        <w:rPr>
-          <w:rFonts w:ascii="Trebuchet MS" w:hAnsi="Trebuchet MS"/>
-          <w:szCs w:val="20"/>
+        <w:rPr>
+          <w:rFonts w:cs="Calibri"/>
+        </w:rPr>
+      </w:pPr>
+      <w:r>
+        <w:rPr>
+          <w:rFonts w:cs="Calibri"/>
         </w:rPr>
         <w:t xml:space="preserve">{% </w:t>
       </w:r>
       <w:proofErr w:type="spellStart"/>
       <w:r>
         <w:rPr>
-          <w:rFonts w:ascii="Trebuchet MS" w:hAnsi="Trebuchet MS"/>
-          <w:szCs w:val="20"/>
+          <w:rFonts w:cs="Calibri"/>
         </w:rPr>
         <w:t>else</w:t>
       </w:r>
       <w:proofErr w:type="spellEnd"/>
       <w:r>
         <w:rPr>
-          <w:rFonts w:ascii="Trebuchet MS" w:hAnsi="Trebuchet MS"/>
-          <w:szCs w:val="20"/>
+          <w:rFonts w:cs="Calibri"/>
         </w:rPr>
         <w:t xml:space="preserve"> %}Ο ΙΔΙΟΚΤΗΤΗΣ δεν προμηθεύει οποιαδήποτε κλειδιά στον ΕΝΟΙΚΙΑΣΤΗ</w:t>
       </w:r>
       <w:r>
         <w:rPr>
-          <w:rFonts w:ascii="Trebuchet MS" w:hAnsi="Trebuchet MS"/>
-          <w:szCs w:val="20"/>
+          <w:rFonts w:cs="Calibri"/>
         </w:rPr>
         <w:t>.</w:t>
       </w:r>
       <w:r>
         <w:rPr>
-          <w:rFonts w:ascii="Trebuchet MS" w:hAnsi="Trebuchet MS"/>
-          <w:szCs w:val="20"/>
+          <w:rFonts w:cs="Calibri"/>
         </w:rPr>
         <w:t xml:space="preserve">{% </w:t>
       </w:r>
       <w:proofErr w:type="spellStart"/>
       <w:r>
         <w:rPr>
-          <w:rFonts w:ascii="Trebuchet MS" w:hAnsi="Trebuchet MS"/>
-          <w:szCs w:val="20"/>
+          <w:rFonts w:cs="Calibri"/>
         </w:rPr>
         <w:t>endif</w:t>
       </w:r>
       <w:proofErr w:type="spellEnd"/>
       <w:r>
         <w:rPr>
-          <w:rFonts w:ascii="Trebuchet MS" w:hAnsi="Trebuchet MS"/>
-          <w:szCs w:val="20"/>
+          <w:rFonts w:cs="Calibri"/>
         </w:rPr>
         <w:t xml:space="preserve"> %}</w:t>
       </w:r>
@@ -5510,7 +5521,7 @@
           <v:path o:extrusionok="f" gradientshapeok="t" o:connecttype="rect"/>
           <o:lock v:ext="edit" aspectratio="t"/>
         </v:shapetype>
-        <v:shape id="Picture 1" o:spid="_x0000_i1025" type="#_x0000_t75" style="width:77.35pt;height:46pt;visibility:visible">
+        <v:shape id="Picture 1" o:spid="_x0000_i1025" type="#_x0000_t75" style="width:77.5pt;height:46pt;visibility:visible">
           <v:imagedata r:id="rId1" o:title=""/>
         </v:shape>
       </w:pict>

</xml_diff>